<commit_message>
chore: HPU template - drop redundant Project Name row from cover box
The cover-box table on the HPU offer's first page was carrying both
'Project / Equipment' and 'Project Name' rows, but for HPU the two
are the same string (the equipment line). New layout:

  Project / Equipment | Hydraulic Pumping Unit - Duplex 1, 12 kW @ 160 LPH
  Client              | PP Rolling Mills
  Enquiry No.         | ENCON.04026.022/FBD/NK DT.03/06/2026

Implemented in the template builder so the change survives a rebuild.

Co-Authored-By: Claude Opus 4.7 <noreply@anthropic.com>
</commit_message>
<xml_diff>
--- a/HPU_Offer_Template.docx
+++ b/HPU_Offer_Template.docx
@@ -152,69 +152,6 @@
             </w:pPr>
             <w:r>
               <w:t>{{equipment_name}}</w:t>
-            </w:r>
-          </w:p>
-        </w:tc>
-      </w:tr>
-      <w:tr>
-        <w:tc>
-          <w:tcPr>
-            <w:tcW w:w="2400" w:type="dxa"/>
-            <w:shd w:fill="FFFFFF" w:val="clear"/>
-            <w:tcMar>
-              <w:top w:w="100" w:type="dxa"/>
-              <w:bottom w:w="100" w:type="dxa"/>
-              <w:left w:w="140" w:type="dxa"/>
-              <w:right w:w="140" w:type="dxa"/>
-            </w:tcMar>
-            <w:tcBorders>
-              <w:top w:val="single" w:sz="4" w:color="BFBFBF"/>
-              <w:bottom w:val="single" w:sz="4" w:color="BFBFBF"/>
-              <w:left w:val="single" w:sz="4" w:color="BFBFBF"/>
-              <w:right w:val="single" w:sz="4" w:color="BFBFBF"/>
-            </w:tcBorders>
-            <w:vAlign w:val="center"/>
-          </w:tcPr>
-          <w:p>
-            <w:pPr>
-              <w:spacing w:before="40" w:after="40"/>
-            </w:pPr>
-            <w:r>
-              <w:rPr>
-                <w:rFonts w:ascii="Calibri" w:cs="Calibri" w:eastAsia="Calibri" w:hAnsi="Calibri"/>
-                <w:b/>
-                <w:bCs/>
-                <w:sz w:val="22"/>
-                <w:szCs w:val="22"/>
-              </w:rPr>
-              <w:t xml:space="preserve">Project Name</w:t>
-            </w:r>
-          </w:p>
-        </w:tc>
-        <w:tc>
-          <w:tcPr>
-            <w:tcW w:w="4800" w:type="dxa"/>
-            <w:shd w:fill="FFFFFF" w:val="clear"/>
-            <w:tcMar>
-              <w:top w:w="100" w:type="dxa"/>
-              <w:bottom w:w="100" w:type="dxa"/>
-              <w:left w:w="140" w:type="dxa"/>
-              <w:right w:w="140" w:type="dxa"/>
-            </w:tcMar>
-            <w:tcBorders>
-              <w:top w:val="single" w:sz="4" w:color="BFBFBF"/>
-              <w:bottom w:val="single" w:sz="4" w:color="BFBFBF"/>
-              <w:left w:val="single" w:sz="4" w:color="BFBFBF"/>
-              <w:right w:val="single" w:sz="4" w:color="BFBFBF"/>
-            </w:tcBorders>
-            <w:vAlign w:val="center"/>
-          </w:tcPr>
-          <w:p>
-            <w:pPr>
-              <w:spacing w:before="40" w:after="40"/>
-            </w:pPr>
-            <w:r>
-              <w:t>{{project_name}}</w:t>
             </w:r>
           </w:p>
         </w:tc>

</xml_diff>

<commit_message>
chore: HPU template - delete fabricated spec rows
Drop the three rows I had stubbed with plausible-but-unverified
values rather than real ENCON catalog data:

  - Construction       'MS skid-mounted with pre-wired control panel'
  - Electrical Supply  '415 V / 3 Phase / 50 Hz, 4-Wire'
  - Operating Pressure 'Up to 7 kg/cm² (adjustable)'

The HPU Specifications table now shows only fields sourced from
actual inputs / catalog lookups:
  Equipment | Variant | Motor Capacity | Oil Flow Rate | Quantity

If real construction / electrical / pressure values are needed
later, add them as authored constants here or wire them to a
master table.

Co-Authored-By: Claude Opus 4.7 <noreply@anthropic.com>
</commit_message>
<xml_diff>
--- a/HPU_Offer_Template.docx
+++ b/HPU_Offer_Template.docx
@@ -2943,72 +2943,6 @@
           <w:p>
             <w:r>
               <w:t>{{ hpu_qty }} No.</w:t>
-            </w:r>
-          </w:p>
-        </w:tc>
-      </w:tr>
-      <w:tr>
-        <w:tc>
-          <w:tcPr>
-            <w:tcW w:type="dxa" w:w="3744"/>
-          </w:tcPr>
-          <w:p>
-            <w:r>
-              <w:t>Construction</w:t>
-            </w:r>
-          </w:p>
-        </w:tc>
-        <w:tc>
-          <w:tcPr>
-            <w:tcW w:type="dxa" w:w="5616"/>
-          </w:tcPr>
-          <w:p>
-            <w:r>
-              <w:t>MS skid-mounted with pre-wired control panel</w:t>
-            </w:r>
-          </w:p>
-        </w:tc>
-      </w:tr>
-      <w:tr>
-        <w:tc>
-          <w:tcPr>
-            <w:tcW w:type="dxa" w:w="3744"/>
-          </w:tcPr>
-          <w:p>
-            <w:r>
-              <w:t>Electrical Supply</w:t>
-            </w:r>
-          </w:p>
-        </w:tc>
-        <w:tc>
-          <w:tcPr>
-            <w:tcW w:type="dxa" w:w="5616"/>
-          </w:tcPr>
-          <w:p>
-            <w:r>
-              <w:t>415 V / 3 Phase / 50 Hz, 4-Wire</w:t>
-            </w:r>
-          </w:p>
-        </w:tc>
-      </w:tr>
-      <w:tr>
-        <w:tc>
-          <w:tcPr>
-            <w:tcW w:type="dxa" w:w="3744"/>
-          </w:tcPr>
-          <w:p>
-            <w:r>
-              <w:t>Operating Pressure</w:t>
-            </w:r>
-          </w:p>
-        </w:tc>
-        <w:tc>
-          <w:tcPr>
-            <w:tcW w:type="dxa" w:w="5616"/>
-          </w:tcPr>
-          <w:p>
-            <w:r>
-              <w:t>Up to 7 kg/cm² (adjustable)</w:t>
             </w:r>
           </w:p>
         </w:tc>

</xml_diff>

<commit_message>
chore: HPU template - delete fabricated Annexure I scope list
The 15-item HPU scope-of-supply list was authored by the AI from
general engineering knowledge rather than sourced from any ENCON
catalog. Setting _HPU_SCOPE_ITEMS = [] so the Annexure I scope
table renders only its header + 'Hydraulic Pumping Unit' banner
row, with no numbered items.

Populate the list with real catalog entries (or wire it to a
master table) when the data is available.

Co-Authored-By: Claude Opus 4.7 <noreply@anthropic.com>
</commit_message>
<xml_diff>
--- a/HPU_Offer_Template.docx
+++ b/HPU_Offer_Template.docx
@@ -3076,336 +3076,6 @@
                 <w:b/>
               </w:rPr>
               <w:t>Hydraulic Pumping Unit</w:t>
-            </w:r>
-          </w:p>
-        </w:tc>
-      </w:tr>
-      <w:tr>
-        <w:tc>
-          <w:tcPr>
-            <w:tcW w:type="dxa" w:w="900"/>
-          </w:tcPr>
-          <w:p>
-            <w:r>
-              <w:t>1</w:t>
-            </w:r>
-          </w:p>
-        </w:tc>
-        <w:tc>
-          <w:tcPr>
-            <w:tcW w:type="dxa" w:w="8460"/>
-          </w:tcPr>
-          <w:p>
-            <w:r>
-              <w:t>Oil tank — MS construction with cleaning door, breather, level indicator, drain plug  (1 No.)</w:t>
-            </w:r>
-          </w:p>
-        </w:tc>
-      </w:tr>
-      <w:tr>
-        <w:tc>
-          <w:tcPr>
-            <w:tcW w:type="dxa" w:w="900"/>
-          </w:tcPr>
-          <w:p>
-            <w:r>
-              <w:t>2</w:t>
-            </w:r>
-          </w:p>
-        </w:tc>
-        <w:tc>
-          <w:tcPr>
-            <w:tcW w:type="dxa" w:w="8460"/>
-          </w:tcPr>
-          <w:p>
-            <w:r>
-              <w:t>Gear pump suitable for fuel-oil service  ({% if "duplex" in hpu_variant.lower() %}2 Nos.{% else %}1 No.{% endif %})</w:t>
-            </w:r>
-          </w:p>
-        </w:tc>
-      </w:tr>
-      <w:tr>
-        <w:tc>
-          <w:tcPr>
-            <w:tcW w:type="dxa" w:w="900"/>
-          </w:tcPr>
-          <w:p>
-            <w:r>
-              <w:t>3</w:t>
-            </w:r>
-          </w:p>
-        </w:tc>
-        <w:tc>
-          <w:tcPr>
-            <w:tcW w:type="dxa" w:w="8460"/>
-          </w:tcPr>
-          <w:p>
-            <w:r>
-              <w:t>TEFC motor — {{ hpu_kw }} kW × 1440 RPM × 415V / 3-Ph / 50 Hz  ({% if "duplex" in hpu_variant.lower() %}2 Nos.{% else %}1 No.{% endif %})</w:t>
-            </w:r>
-          </w:p>
-        </w:tc>
-      </w:tr>
-      <w:tr>
-        <w:tc>
-          <w:tcPr>
-            <w:tcW w:type="dxa" w:w="900"/>
-          </w:tcPr>
-          <w:p>
-            <w:r>
-              <w:t>4</w:t>
-            </w:r>
-          </w:p>
-        </w:tc>
-        <w:tc>
-          <w:tcPr>
-            <w:tcW w:type="dxa" w:w="8460"/>
-          </w:tcPr>
-          <w:p>
-            <w:r>
-              <w:t>Coupling with guard (pump-motor)  ({% if "duplex" in hpu_variant.lower() %}2 Nos.{% else %}1 No.{% endif %})</w:t>
-            </w:r>
-          </w:p>
-        </w:tc>
-      </w:tr>
-      <w:tr>
-        <w:tc>
-          <w:tcPr>
-            <w:tcW w:type="dxa" w:w="900"/>
-          </w:tcPr>
-          <w:p>
-            <w:r>
-              <w:t>5</w:t>
-            </w:r>
-          </w:p>
-        </w:tc>
-        <w:tc>
-          <w:tcPr>
-            <w:tcW w:type="dxa" w:w="8460"/>
-          </w:tcPr>
-          <w:p>
-            <w:r>
-              <w:t>Suction strainer 150 micron  ({% if "duplex" in hpu_variant.lower() %}2 Nos.{% else %}1 No.{% endif %})</w:t>
-            </w:r>
-          </w:p>
-        </w:tc>
-      </w:tr>
-      <w:tr>
-        <w:tc>
-          <w:tcPr>
-            <w:tcW w:type="dxa" w:w="900"/>
-          </w:tcPr>
-          <w:p>
-            <w:r>
-              <w:t>6</w:t>
-            </w:r>
-          </w:p>
-        </w:tc>
-        <w:tc>
-          <w:tcPr>
-            <w:tcW w:type="dxa" w:w="8460"/>
-          </w:tcPr>
-          <w:p>
-            <w:r>
-              <w:t>Pressure relief valve  ({% if "duplex" in hpu_variant.lower() %}2 Nos.{% else %}1 No.{% endif %})</w:t>
-            </w:r>
-          </w:p>
-        </w:tc>
-      </w:tr>
-      <w:tr>
-        <w:tc>
-          <w:tcPr>
-            <w:tcW w:type="dxa" w:w="900"/>
-          </w:tcPr>
-          <w:p>
-            <w:r>
-              <w:t>7</w:t>
-            </w:r>
-          </w:p>
-        </w:tc>
-        <w:tc>
-          <w:tcPr>
-            <w:tcW w:type="dxa" w:w="8460"/>
-          </w:tcPr>
-          <w:p>
-            <w:r>
-              <w:t>Pressure gauge with isolation valve (0–10 kg/cm²)  (1 No.)</w:t>
-            </w:r>
-          </w:p>
-        </w:tc>
-      </w:tr>
-      <w:tr>
-        <w:tc>
-          <w:tcPr>
-            <w:tcW w:type="dxa" w:w="900"/>
-          </w:tcPr>
-          <w:p>
-            <w:r>
-              <w:t>8</w:t>
-            </w:r>
-          </w:p>
-        </w:tc>
-        <w:tc>
-          <w:tcPr>
-            <w:tcW w:type="dxa" w:w="8460"/>
-          </w:tcPr>
-          <w:p>
-            <w:r>
-              <w:t>Duplex line strainer 25 micron (changeover type) / Inline strainer 25 micron  (1 No.)</w:t>
-            </w:r>
-          </w:p>
-        </w:tc>
-      </w:tr>
-      <w:tr>
-        <w:tc>
-          <w:tcPr>
-            <w:tcW w:type="dxa" w:w="900"/>
-          </w:tcPr>
-          <w:p>
-            <w:r>
-              <w:t>9</w:t>
-            </w:r>
-          </w:p>
-        </w:tc>
-        <w:tc>
-          <w:tcPr>
-            <w:tcW w:type="dxa" w:w="8460"/>
-          </w:tcPr>
-          <w:p>
-            <w:r>
-              <w:t>Non-return valve  ({% if "duplex" in hpu_variant.lower() %}2 Nos.{% else %}1 No.{% endif %})</w:t>
-            </w:r>
-          </w:p>
-        </w:tc>
-      </w:tr>
-      <w:tr>
-        <w:tc>
-          <w:tcPr>
-            <w:tcW w:type="dxa" w:w="900"/>
-          </w:tcPr>
-          <w:p>
-            <w:r>
-              <w:t>10</w:t>
-            </w:r>
-          </w:p>
-        </w:tc>
-        <w:tc>
-          <w:tcPr>
-            <w:tcW w:type="dxa" w:w="8460"/>
-          </w:tcPr>
-          <w:p>
-            <w:r>
-              <w:t>Pressure switch (low-pressure cut-off)  (1 No.)</w:t>
-            </w:r>
-          </w:p>
-        </w:tc>
-      </w:tr>
-      <w:tr>
-        <w:tc>
-          <w:tcPr>
-            <w:tcW w:type="dxa" w:w="900"/>
-          </w:tcPr>
-          <w:p>
-            <w:r>
-              <w:t>11</w:t>
-            </w:r>
-          </w:p>
-        </w:tc>
-        <w:tc>
-          <w:tcPr>
-            <w:tcW w:type="dxa" w:w="8460"/>
-          </w:tcPr>
-          <w:p>
-            <w:r>
-              <w:t>Float-type oil level switch (low-level cut-off)  (1 No.)</w:t>
-            </w:r>
-          </w:p>
-        </w:tc>
-      </w:tr>
-      <w:tr>
-        <w:tc>
-          <w:tcPr>
-            <w:tcW w:type="dxa" w:w="900"/>
-          </w:tcPr>
-          <w:p>
-            <w:r>
-              <w:t>12</w:t>
-            </w:r>
-          </w:p>
-        </w:tc>
-        <w:tc>
-          <w:tcPr>
-            <w:tcW w:type="dxa" w:w="8460"/>
-          </w:tcPr>
-          <w:p>
-            <w:r>
-              <w:t>Inter-connecting piping inside the unit  (Lot)</w:t>
-            </w:r>
-          </w:p>
-        </w:tc>
-      </w:tr>
-      <w:tr>
-        <w:tc>
-          <w:tcPr>
-            <w:tcW w:type="dxa" w:w="900"/>
-          </w:tcPr>
-          <w:p>
-            <w:r>
-              <w:t>13</w:t>
-            </w:r>
-          </w:p>
-        </w:tc>
-        <w:tc>
-          <w:tcPr>
-            <w:tcW w:type="dxa" w:w="8460"/>
-          </w:tcPr>
-          <w:p>
-            <w:r>
-              <w:t>Common skid base frame with mounting bolts  (1 No.)</w:t>
-            </w:r>
-          </w:p>
-        </w:tc>
-      </w:tr>
-      <w:tr>
-        <w:tc>
-          <w:tcPr>
-            <w:tcW w:type="dxa" w:w="900"/>
-          </w:tcPr>
-          <w:p>
-            <w:r>
-              <w:t>14</w:t>
-            </w:r>
-          </w:p>
-        </w:tc>
-        <w:tc>
-          <w:tcPr>
-            <w:tcW w:type="dxa" w:w="8460"/>
-          </w:tcPr>
-          <w:p>
-            <w:r>
-              <w:t>Control panel — start / stop / interlock / indication  (1 No.)</w:t>
-            </w:r>
-          </w:p>
-        </w:tc>
-      </w:tr>
-      <w:tr>
-        <w:tc>
-          <w:tcPr>
-            <w:tcW w:type="dxa" w:w="900"/>
-          </w:tcPr>
-          <w:p>
-            <w:r>
-              <w:t>15</w:t>
-            </w:r>
-          </w:p>
-        </w:tc>
-        <w:tc>
-          <w:tcPr>
-            <w:tcW w:type="dxa" w:w="8460"/>
-          </w:tcPr>
-          <w:p>
-            <w:r>
-              <w:t>Set of foundation bolts &amp; matching flanges  (1 Lot)</w:t>
             </w:r>
           </w:p>
         </w:tc>

</xml_diff>

<commit_message>
chore: HPU template - drop Supervision sub-table; renumber Annexures
Two follow-ups to 6d17d58:

1. Strip the 3-row Supervision Charges sub-table that sat just
   below the Price Schedule (Mechanical / PLC / Note rows). HPU
   offers don't quote erection or commissioning supervision
   separately, so the whole table + trailing blank paragraph are
   removed by _remove_supervision_table().

2. Renumber Annexures III -> II and IV -> III everywhere (body
   headings + cover-page List of Annexures table). After Annexure
   II Exclusions was removed in 6d17d58, the doc was reading
   I -> III -> IV; it now reads I -> II -> III consistently.

   Replacement order matters — III is renamed before IV so the
   newly-created 'III' (formerly IV) is not collapsed back to II.
   Per-paragraph runs are joined and stamped back into the first
   run so headings Word split across multiple <w:t> elements are
   handled.

Co-Authored-By: Claude Opus 4.7 <noreply@anthropic.com>
</commit_message>
<xml_diff>
--- a/HPU_Offer_Template.docx
+++ b/HPU_Offer_Template.docx
@@ -1322,7 +1322,7 @@
                 <w:sz w:val="22"/>
                 <w:szCs w:val="22"/>
               </w:rPr>
-              <w:t xml:space="preserve">Annexure III</w:t>
+              <w:t xml:space="preserve">Annexure II</w:t>
             </w:r>
           </w:p>
         </w:tc>
@@ -1428,7 +1428,7 @@
                 <w:sz w:val="22"/>
                 <w:szCs w:val="22"/>
               </w:rPr>
-              <w:t xml:space="preserve">Annexure IV</w:t>
+              <w:t xml:space="preserve">Annexure III</w:t>
             </w:r>
           </w:p>
         </w:tc>
@@ -2780,7 +2780,7 @@
           <w:sz w:val="32"/>
           <w:szCs w:val="32"/>
         </w:rPr>
-        <w:t>ANNEXURE III — PRICE SCHEDULE</w:t>
+        <w:t>ANNEXURE II — PRICE SCHEDULE</w:t>
       </w:r>
     </w:p>
     <w:tbl>
@@ -3300,92 +3300,6 @@
         <w:spacing w:before="240" w:after="0"/>
       </w:pPr>
     </w:p>
-    <w:tbl>
-      <w:tblPr>
-        <w:tblW w:type="dxa" w:w="9360"/>
-        <w:tblBorders>
-          <w:top w:val="single" w:sz="6" w:color="auto"/>
-          <w:left w:val="single" w:sz="6" w:color="auto"/>
-          <w:bottom w:val="single" w:sz="6" w:color="auto"/>
-          <w:right w:val="single" w:sz="6" w:color="auto"/>
-          <w:insideH w:val="single" w:sz="6" w:color="auto"/>
-          <w:insideV w:val="single" w:sz="6" w:color="auto"/>
-        </w:tblBorders>
-      </w:tblPr>
-      <w:tblGrid>
-        <w:gridCol w:w="6360"/>
-        <w:gridCol w:w="3000"/>
-      </w:tblGrid>
-      <w:tr>
-        <w:trPr>
-          <w:trHeight w:val="425" w:hRule="atLeast"/>
-        </w:trPr>
-        <w:tc>
-          <w:tcPr>
-            <w:tcW w:type="dxa" w:w="6360"/>
-          </w:tcPr>
-          <w:p>
-            <w:r>
-              <w:t>Supervision Charges for Erection and Commissioning (Mechanical)</w:t>
-            </w:r>
-          </w:p>
-        </w:tc>
-        <w:tc>
-          <w:tcPr>
-            <w:tcW w:type="dxa" w:w="3000"/>
-          </w:tcPr>
-          <w:p>
-            <w:r>
-              <w:t xml:space="preserve">INR {{ supervision_mech }}</w:t>
-            </w:r>
-          </w:p>
-        </w:tc>
-      </w:tr>
-      <w:tr>
-        <w:trPr>
-          <w:trHeight w:val="425" w:hRule="atLeast"/>
-        </w:trPr>
-        <w:tc>
-          <w:tcPr>
-            <w:tcW w:type="dxa" w:w="6360"/>
-          </w:tcPr>
-          <w:p>
-            <w:r>
-              <w:t>Supervision Charges for Erection and Commissioning (PLC and Instrumentation)</w:t>
-            </w:r>
-          </w:p>
-        </w:tc>
-        <w:tc>
-          <w:tcPr>
-            <w:tcW w:type="dxa" w:w="3000"/>
-          </w:tcPr>
-          <w:p>
-            <w:r>
-              <w:t xml:space="preserve">INR {{ supervision_plc }}</w:t>
-            </w:r>
-          </w:p>
-        </w:tc>
-      </w:tr>
-      <w:tr>
-        <w:trPr>
-          <w:trHeight w:val="425" w:hRule="atLeast"/>
-        </w:trPr>
-        <w:tc>
-          <w:tcPr>
-            <w:tcW w:type="dxa" w:w="9360"/>
-            <w:gridSpan w:val="2"/>
-          </w:tcPr>
-          <w:p>
-            <w:r>
-              <w:rPr>
-                <w:i/>
-              </w:rPr>
-              <w:t>Note: To-and-fro fare from Delhi to site, plus boarding, lodging, local conveyance, and medical assistance if required.</w:t>
-            </w:r>
-          </w:p>
-        </w:tc>
-      </w:tr>
-    </w:tbl>
     <w:p>
       <w:pPr>
         <w:pStyle w:val="Heading1"/>
@@ -3403,7 +3317,7 @@
           <w:sz w:val="32"/>
           <w:szCs w:val="32"/>
         </w:rPr>
-        <w:t>ANNEXURE IV — TERMS &amp; CONDITIONS</w:t>
+        <w:t>ANNEXURE III — TERMS &amp; CONDITIONS</w:t>
       </w:r>
     </w:p>
     <w:tbl>

</xml_diff>

<commit_message>
feat: HPU/PU offers reuse the VLPH pumping-unit intro + bullets
The individual HPU and PU offers had a one-line scope. They now render the same
intro paragraph + component bullets as the Vertical Ladle's HPU/PU section, via
the shared _pumping_unit_block. Added a force_pumping_only override so the PU
offer is 'pumping only' (no heater) and the HPU offer is 'heating + pumping'
regardless of fuel name. HPU/PU templates gained {{ pumping_unit_intro }} +
the pumping_unit_items bullet loop. VLPH section unchanged. Verified both renders.
</commit_message>
<xml_diff>
--- a/HPU_Offer_Template.docx
+++ b/HPU_Offer_Template.docx
@@ -2667,7 +2667,25 @@
         <w:rPr>
           <w:rFonts w:ascii="Calibri" w:cs="Calibri" w:eastAsia="Calibri" w:hAnsi="Calibri"/>
         </w:rPr>
-        <w:t xml:space="preserve">The Scope of supply covers Design, manufacturing and supply of the Heating and Pumping Unit.</w:t>
+        <w:t>{{ pumping_unit_intro }}</w:t>
+      </w:r>
+    </w:p>
+    <w:p>
+      <w:r>
+        <w:t>{%p for x in pumping_unit_items %}</w:t>
+      </w:r>
+    </w:p>
+    <w:p>
+      <w:pPr>
+        <w:pStyle w:val="ListParagraph"/>
+      </w:pPr>
+      <w:r>
+        <w:t>{{ x.item }}</w:t>
+      </w:r>
+    </w:p>
+    <w:p>
+      <w:r>
+        <w:t>{%p endfor %}</w:t>
       </w:r>
     </w:p>
     <w:p>

</xml_diff>

<commit_message>
fix: bullet the pumping-unit scope items in HPU/PU offers
The items were rendering as plain paragraphs ('List Paragraph' style carries no
bullet on its own). Added numPr (numId=1 bullet list, ilvl=0) to the
{{ x.item }} loop paragraph in both templates so the scope items render as a
proper bulleted list, matching the VLPH offer.
</commit_message>
<xml_diff>
--- a/HPU_Offer_Template.docx
+++ b/HPU_Offer_Template.docx
@@ -2678,6 +2678,10 @@
     <w:p>
       <w:pPr>
         <w:pStyle w:val="ListParagraph"/>
+        <w:numPr>
+          <w:ilvl w:val="0"/>
+          <w:numId w:val="1"/>
+        </w:numPr>
       </w:pPr>
       <w:r>
         <w:t>{{ x.item }}</w:t>

</xml_diff>

<commit_message>
style: drop "Motor Capacity" row from HPU/PU Technical Specifications
Not needed in the offer — the kW already appears in the Equipment line and
Variant. Removed from both HPU and PU spec tables.

Co-Authored-By: Claude Opus 4.8 <noreply@anthropic.com>
</commit_message>
<xml_diff>
--- a/HPU_Offer_Template.docx
+++ b/HPU_Offer_Template.docx
@@ -2314,40 +2314,6 @@
           <w:p>
             <w:r>
               <w:t>{{ hpu_variant }}</w:t>
-            </w:r>
-          </w:p>
-        </w:tc>
-      </w:tr>
-      <w:tr>
-        <w:tc>
-          <w:tcPr>
-            <w:tcW w:type="dxa" w:w="3744"/>
-            <w:tcBorders>
-              <w:top w:val="single" w:sz="4" w:space="0" w:color="BFBFBF"/>
-              <w:left w:val="single" w:sz="4" w:space="0" w:color="BFBFBF"/>
-              <w:bottom w:val="single" w:sz="4" w:space="0" w:color="BFBFBF"/>
-              <w:right w:val="single" w:sz="4" w:space="0" w:color="BFBFBF"/>
-            </w:tcBorders>
-          </w:tcPr>
-          <w:p>
-            <w:r>
-              <w:t>Motor Capacity</w:t>
-            </w:r>
-          </w:p>
-        </w:tc>
-        <w:tc>
-          <w:tcPr>
-            <w:tcW w:type="dxa" w:w="5616"/>
-            <w:tcBorders>
-              <w:top w:val="single" w:sz="4" w:space="0" w:color="BFBFBF"/>
-              <w:left w:val="single" w:sz="4" w:space="0" w:color="BFBFBF"/>
-              <w:bottom w:val="single" w:sz="4" w:space="0" w:color="BFBFBF"/>
-              <w:right w:val="single" w:sz="4" w:space="0" w:color="BFBFBF"/>
-            </w:tcBorders>
-          </w:tcPr>
-          <w:p>
-            <w:r>
-              <w:t>{{ hpu_kw }} kW</w:t>
             </w:r>
           </w:p>
         </w:tc>

</xml_diff>